<commit_message>
daylis 8 y 9 sprint 4
</commit_message>
<xml_diff>
--- a/Fase 2/Evidencia del Proyecto/Evidencias de documentacion/Metodologia Scrum/Sprint 01234/Sprint 4/Daylis/Dailys 8- Sprint 4 .docx
+++ b/Fase 2/Evidencia del Proyecto/Evidencias de documentacion/Metodologia Scrum/Sprint 01234/Sprint 4/Daylis/Dailys 8- Sprint 4 .docx
@@ -13,7 +13,6 @@
           <w:u w:val="single"/>
         </w:rPr>
       </w:pPr>
-      <w:proofErr w:type="spellStart"/>
       <w:r>
         <w:rPr>
           <w:b/>
@@ -24,7 +23,6 @@
         </w:rPr>
         <w:t>Dailys</w:t>
       </w:r>
-      <w:proofErr w:type="spellEnd"/>
     </w:p>
     <w:p>
       <w:pPr>
@@ -116,7 +114,6 @@
           <w:numId w:val="8"/>
         </w:numPr>
       </w:pPr>
-      <w:proofErr w:type="spellStart"/>
       <w:r>
         <w:t>Da</w:t>
       </w:r>
@@ -130,14 +127,10 @@
         <w:t>i</w:t>
       </w:r>
       <w:r>
-        <w:t>s</w:t>
-      </w:r>
-      <w:proofErr w:type="spellEnd"/>
-      <w:r>
-        <w:t xml:space="preserve"> </w:t>
+        <w:t xml:space="preserve">s </w:t>
       </w:r>
       <w:r>
-        <w:t>7</w:t>
+        <w:t>8</w:t>
       </w:r>
     </w:p>
     <w:p>
@@ -176,15 +169,7 @@
         <w:t>Israel Muñoz</w:t>
       </w:r>
       <w:r>
-        <w:t xml:space="preserve"> (</w:t>
-      </w:r>
-      <w:proofErr w:type="spellStart"/>
-      <w:r>
-        <w:t>Product</w:t>
-      </w:r>
-      <w:proofErr w:type="spellEnd"/>
-      <w:r>
-        <w:t xml:space="preserve"> Owner / desarrollador)</w:t>
+        <w:t xml:space="preserve"> (Product Owner / desarrollador)</w:t>
       </w:r>
     </w:p>
     <w:p>

</xml_diff>